<commit_message>
Release 1.2 - Remove SMO Dependency
</commit_message>
<xml_diff>
--- a/Azure SQL PAYGO Assessment.docx
+++ b/Azure SQL PAYGO Assessment.docx
@@ -1,6 +1,6 @@
 
 <file path=word/document.xml><?xml version="1.0" encoding="utf-8"?>
-<w:document xmlns:wpc="http://schemas.microsoft.com/office/word/2010/wordprocessingCanvas" xmlns:cx="http://schemas.microsoft.com/office/drawing/2014/chartex" xmlns:cx1="http://schemas.microsoft.com/office/drawing/2015/9/8/chartex" xmlns:cx2="http://schemas.microsoft.com/office/drawing/2015/10/21/chartex" xmlns:cx3="http://schemas.microsoft.com/office/drawing/2016/5/9/chartex" xmlns:cx4="http://schemas.microsoft.com/office/drawing/2016/5/10/chartex" xmlns:cx5="http://schemas.microsoft.com/office/drawing/2016/5/11/chartex" xmlns:cx6="http://schemas.microsoft.com/office/drawing/2016/5/12/chartex" xmlns:cx7="http://schemas.microsoft.com/office/drawing/2016/5/13/chartex" xmlns:cx8="http://schemas.microsoft.com/office/drawing/2016/5/14/chartex" xmlns:mc="http://schemas.openxmlformats.org/markup-compatibility/2006" xmlns:aink="http://schemas.microsoft.com/office/drawing/2016/ink" xmlns:am3d="http://schemas.microsoft.com/office/drawing/2017/model3d" xmlns:o="urn:schemas-microsoft-com:office:office" xmlns:oel="http://schemas.microsoft.com/office/2019/extlst" xmlns:r="http://schemas.openxmlformats.org/officeDocument/2006/relationships" xmlns:m="http://schemas.openxmlformats.org/officeDocument/2006/math" xmlns:v="urn:schemas-microsoft-com:vml" xmlns:wp14="http://schemas.microsoft.com/office/word/2010/wordprocessingDrawing" xmlns:wp="http://schemas.openxmlformats.org/drawingml/2006/wordprocessingDrawing" xmlns:w10="urn:schemas-microsoft-com:office:word" xmlns:w="http://schemas.openxmlformats.org/wordprocessingml/2006/main" xmlns:w14="http://schemas.microsoft.com/office/word/2010/wordml" xmlns:w15="http://schemas.microsoft.com/office/word/2012/wordml" xmlns:w16cex="http://schemas.microsoft.com/office/word/2018/wordml/cex" xmlns:w16cid="http://schemas.microsoft.com/office/word/2016/wordml/cid" xmlns:w16="http://schemas.microsoft.com/office/word/2018/wordml" xmlns:w16du="http://schemas.microsoft.com/office/word/2023/wordml/word16du" xmlns:w16sdtdh="http://schemas.microsoft.com/office/word/2020/wordml/sdtdatahash" xmlns:w16se="http://schemas.microsoft.com/office/word/2015/wordml/symex" xmlns:wpg="http://schemas.microsoft.com/office/word/2010/wordprocessingGroup" xmlns:wpi="http://schemas.microsoft.com/office/word/2010/wordprocessingInk" xmlns:wne="http://schemas.microsoft.com/office/word/2006/wordml" xmlns:wps="http://schemas.microsoft.com/office/word/2010/wordprocessingShape" mc:Ignorable="w14 w15 w16se w16cid w16 w16cex w16sdtdh w16du wp14">
+<w:document xmlns:wpc="http://schemas.microsoft.com/office/word/2010/wordprocessingCanvas" xmlns:cx="http://schemas.microsoft.com/office/drawing/2014/chartex" xmlns:cx1="http://schemas.microsoft.com/office/drawing/2015/9/8/chartex" xmlns:cx2="http://schemas.microsoft.com/office/drawing/2015/10/21/chartex" xmlns:cx3="http://schemas.microsoft.com/office/drawing/2016/5/9/chartex" xmlns:cx4="http://schemas.microsoft.com/office/drawing/2016/5/10/chartex" xmlns:cx5="http://schemas.microsoft.com/office/drawing/2016/5/11/chartex" xmlns:cx6="http://schemas.microsoft.com/office/drawing/2016/5/12/chartex" xmlns:cx7="http://schemas.microsoft.com/office/drawing/2016/5/13/chartex" xmlns:cx8="http://schemas.microsoft.com/office/drawing/2016/5/14/chartex" xmlns:mc="http://schemas.openxmlformats.org/markup-compatibility/2006" xmlns:aink="http://schemas.microsoft.com/office/drawing/2016/ink" xmlns:am3d="http://schemas.microsoft.com/office/drawing/2017/model3d" xmlns:o="urn:schemas-microsoft-com:office:office" xmlns:oel="http://schemas.microsoft.com/office/2019/extlst" xmlns:r="http://schemas.openxmlformats.org/officeDocument/2006/relationships" xmlns:m="http://schemas.openxmlformats.org/officeDocument/2006/math" xmlns:v="urn:schemas-microsoft-com:vml" xmlns:wp14="http://schemas.microsoft.com/office/word/2010/wordprocessingDrawing" xmlns:wp="http://schemas.openxmlformats.org/drawingml/2006/wordprocessingDrawing" xmlns:w10="urn:schemas-microsoft-com:office:word" xmlns:w="http://schemas.openxmlformats.org/wordprocessingml/2006/main" xmlns:w14="http://schemas.microsoft.com/office/word/2010/wordml" xmlns:w15="http://schemas.microsoft.com/office/word/2012/wordml" xmlns:w16cex="http://schemas.microsoft.com/office/word/2018/wordml/cex" xmlns:w16cid="http://schemas.microsoft.com/office/word/2016/wordml/cid" xmlns:w16="http://schemas.microsoft.com/office/word/2018/wordml" xmlns:w16du="http://schemas.microsoft.com/office/word/2023/wordml/word16du" xmlns:w16sdtdh="http://schemas.microsoft.com/office/word/2020/wordml/sdtdatahash" xmlns:w16sdtfl="http://schemas.microsoft.com/office/word/2024/wordml/sdtformatlock" xmlns:w16se="http://schemas.microsoft.com/office/word/2015/wordml/symex" xmlns:wpg="http://schemas.microsoft.com/office/word/2010/wordprocessingGroup" xmlns:wpi="http://schemas.microsoft.com/office/word/2010/wordprocessingInk" xmlns:wne="http://schemas.microsoft.com/office/word/2006/wordml" xmlns:wps="http://schemas.microsoft.com/office/word/2010/wordprocessingShape" mc:Ignorable="w14 w15 w16se w16cid w16 w16cex w16sdtdh w16sdtfl w16du wp14">
   <w:body>
     <w:p>
       <w:pPr>
@@ -292,21 +292,7 @@
           <w:rFonts w:ascii="Courier New" w:hAnsi="Courier New" w:cs="Courier New"/>
           <w:lang w:val="en-US"/>
         </w:rPr>
-        <w:t xml:space="preserve"> "</w:t>
-      </w:r>
-      <w:r>
-        <w:rPr>
-          <w:rFonts w:ascii="Courier New" w:hAnsi="Courier New" w:cs="Courier New"/>
-          <w:lang w:val="en-US"/>
-        </w:rPr>
-        <w:t>&lt;CMS-Instance&gt;</w:t>
-      </w:r>
-      <w:r>
-        <w:rPr>
-          <w:rFonts w:ascii="Courier New" w:hAnsi="Courier New" w:cs="Courier New"/>
-          <w:lang w:val="en-US"/>
-        </w:rPr>
-        <w:t>" -</w:t>
+        <w:t xml:space="preserve"> "&lt;CMS-Instance&gt;" -</w:t>
       </w:r>
       <w:proofErr w:type="spellStart"/>
       <w:r>
@@ -322,14 +308,7 @@
           <w:rFonts w:ascii="Courier New" w:hAnsi="Courier New" w:cs="Courier New"/>
           <w:lang w:val="en-US"/>
         </w:rPr>
-        <w:t xml:space="preserve"> </w:t>
-      </w:r>
-      <w:r>
-        <w:rPr>
-          <w:rFonts w:ascii="Courier New" w:hAnsi="Courier New" w:cs="Courier New"/>
-          <w:lang w:val="en-US"/>
-        </w:rPr>
-        <w:t>“</w:t>
+        <w:t xml:space="preserve"> “</w:t>
       </w:r>
       <w:r>
         <w:rPr>
@@ -438,21 +417,7 @@
         <w:rPr>
           <w:lang w:val="en-US"/>
         </w:rPr>
-        <w:t xml:space="preserve"> will show the selected servers. You can click OK to </w:t>
-      </w:r>
-      <w:proofErr w:type="gramStart"/>
-      <w:r>
-        <w:rPr>
-          <w:lang w:val="en-US"/>
-        </w:rPr>
-        <w:t>continue, or</w:t>
-      </w:r>
-      <w:proofErr w:type="gramEnd"/>
-      <w:r>
-        <w:rPr>
-          <w:lang w:val="en-US"/>
-        </w:rPr>
-        <w:t xml:space="preserve"> Cancel to stop the deployment.</w:t>
+        <w:t xml:space="preserve"> will show the selected servers. You can click OK to continue, or Cancel to stop the deployment.</w:t>
       </w:r>
     </w:p>
     <w:p>
@@ -494,6 +459,67 @@
           <w:lang w:val="en-US"/>
         </w:rPr>
         <w:t>all server names including instance names. Every server name needs to be in a separate line.</w:t>
+      </w:r>
+    </w:p>
+    <w:p>
+      <w:pPr>
+        <w:rPr>
+          <w:rFonts w:ascii="Courier New" w:hAnsi="Courier New" w:cs="Courier New"/>
+          <w:lang w:val="en-DE"/>
+        </w:rPr>
+      </w:pPr>
+      <w:r>
+        <w:rPr>
+          <w:rFonts w:ascii="Courier New" w:hAnsi="Courier New" w:cs="Courier New"/>
+          <w:lang w:val="en-US"/>
+        </w:rPr>
+        <w:t xml:space="preserve">Deploy-PAYGO-Assessment </w:t>
+      </w:r>
+      <w:r>
+        <w:rPr>
+          <w:rFonts w:ascii="Courier New" w:hAnsi="Courier New" w:cs="Courier New"/>
+          <w:lang w:val="en-US"/>
+        </w:rPr>
+        <w:t>–</w:t>
+      </w:r>
+      <w:proofErr w:type="spellStart"/>
+      <w:r>
+        <w:rPr>
+          <w:rFonts w:ascii="Courier New" w:hAnsi="Courier New" w:cs="Courier New"/>
+          <w:lang w:val="en-DE"/>
+        </w:rPr>
+        <w:t>ServerListFile</w:t>
+      </w:r>
+      <w:proofErr w:type="spellEnd"/>
+      <w:r>
+        <w:rPr>
+          <w:rFonts w:ascii="Courier New" w:hAnsi="Courier New" w:cs="Courier New"/>
+          <w:lang w:val="en-DE"/>
+        </w:rPr>
+        <w:t xml:space="preserve"> </w:t>
+      </w:r>
+      <w:r>
+        <w:rPr>
+          <w:rFonts w:ascii="Courier New" w:hAnsi="Courier New" w:cs="Courier New"/>
+          <w:lang w:val="en-US"/>
+        </w:rPr>
+        <w:t>"&lt;</w:t>
+      </w:r>
+      <w:proofErr w:type="spellStart"/>
+      <w:r>
+        <w:rPr>
+          <w:rFonts w:ascii="Courier New" w:hAnsi="Courier New" w:cs="Courier New"/>
+          <w:lang w:val="en-US"/>
+        </w:rPr>
+        <w:t>path_to_txt_file</w:t>
+      </w:r>
+      <w:proofErr w:type="spellEnd"/>
+      <w:r>
+        <w:rPr>
+          <w:rFonts w:ascii="Courier New" w:hAnsi="Courier New" w:cs="Courier New"/>
+          <w:lang w:val="en-US"/>
+        </w:rPr>
+        <w:t>&gt;"</w:t>
       </w:r>
     </w:p>
     <w:p>
@@ -932,48 +958,7 @@
           <w:lang w:val="en-US"/>
         </w:rPr>
         <w:tab/>
-      </w:r>
-      <w:r>
-        <w:rPr>
-          <w:lang w:val="en-US"/>
-        </w:rPr>
-        <w:t xml:space="preserve">what was the amount of </w:t>
-      </w:r>
-      <w:r>
-        <w:rPr>
-          <w:lang w:val="en-US"/>
-        </w:rPr>
-        <w:t>write</w:t>
-      </w:r>
-      <w:r>
-        <w:rPr>
-          <w:lang w:val="en-US"/>
-        </w:rPr>
-        <w:t xml:space="preserve"> request against this database during the last hour. This value is not the exact number. It will just store a ca. value. The real value was compressed by using POWER(v,0.25). To retrieve the </w:t>
-      </w:r>
-      <w:r>
-        <w:rPr>
-          <w:lang w:val="en-US"/>
-        </w:rPr>
-        <w:t>area,</w:t>
-      </w:r>
-      <w:r>
-        <w:rPr>
-          <w:lang w:val="en-US"/>
-        </w:rPr>
-        <w:t xml:space="preserve"> you will need to calculate POWER(v,4). The stored value can </w:t>
-      </w:r>
-      <w:r>
-        <w:rPr>
-          <w:lang w:val="en-US"/>
-        </w:rPr>
-        <w:t>be</w:t>
-      </w:r>
-      <w:r>
-        <w:rPr>
-          <w:lang w:val="en-US"/>
-        </w:rPr>
-        <w:t xml:space="preserve"> a maximum of 255.</w:t>
+        <w:t>what was the amount of write request against this database during the last hour. This value is not the exact number. It will just store a ca. value. The real value was compressed by using POWER(v,0.25). To retrieve the area, you will need to calculate POWER(v,4). The stored value can be a maximum of 255.</w:t>
       </w:r>
     </w:p>
     <w:p>
@@ -1053,24 +1038,7 @@
           <w:lang w:val="en-US"/>
         </w:rPr>
         <w:tab/>
-      </w:r>
-      <w:r>
-        <w:rPr>
-          <w:lang w:val="en-US"/>
-        </w:rPr>
-        <w:t xml:space="preserve">was there a </w:t>
-      </w:r>
-      <w:r>
-        <w:rPr>
-          <w:lang w:val="en-US"/>
-        </w:rPr>
-        <w:t>diff</w:t>
-      </w:r>
-      <w:r>
-        <w:rPr>
-          <w:lang w:val="en-US"/>
-        </w:rPr>
-        <w:t xml:space="preserve"> backup on the database during the last hour</w:t>
+        <w:t>was there a diff backup on the database during the last hour</w:t>
       </w:r>
     </w:p>
     <w:p>
@@ -1103,24 +1071,7 @@
           <w:lang w:val="en-US"/>
         </w:rPr>
         <w:tab/>
-      </w:r>
-      <w:r>
-        <w:rPr>
-          <w:lang w:val="en-US"/>
-        </w:rPr>
-        <w:t xml:space="preserve">was there a </w:t>
-      </w:r>
-      <w:r>
-        <w:rPr>
-          <w:lang w:val="en-US"/>
-        </w:rPr>
-        <w:t>log</w:t>
-      </w:r>
-      <w:r>
-        <w:rPr>
-          <w:lang w:val="en-US"/>
-        </w:rPr>
-        <w:t xml:space="preserve"> backup on the database during the last hour</w:t>
+        <w:t>was there a log backup on the database during the last hour</w:t>
       </w:r>
     </w:p>
     <w:p>
@@ -1220,21 +1171,7 @@
           <w:lang w:val="en-US"/>
         </w:rPr>
         <w:tab/>
-        <w:t xml:space="preserve">was there a statistic maintenance running during the last hour. This is where the extended event session comes into play. We just check if the statistic was updated during the last hour. If it was an auto update event, we </w:t>
-      </w:r>
-      <w:proofErr w:type="gramStart"/>
-      <w:r>
-        <w:rPr>
-          <w:lang w:val="en-US"/>
-        </w:rPr>
-        <w:t>will</w:t>
-      </w:r>
-      <w:proofErr w:type="gramEnd"/>
-      <w:r>
-        <w:rPr>
-          <w:lang w:val="en-US"/>
-        </w:rPr>
-        <w:t xml:space="preserve"> not count that.</w:t>
+        <w:t>was there a statistic maintenance running during the last hour. This is where the extended event session comes into play. We just check if the statistic was updated during the last hour. If it was an auto update event, we will not count that.</w:t>
       </w:r>
     </w:p>
     <w:p>
@@ -1356,13 +1293,7 @@
         <w:rPr>
           <w:lang w:val="en-US"/>
         </w:rPr>
-        <w:t>Finishing</w:t>
-      </w:r>
-      <w:r>
-        <w:rPr>
-          <w:lang w:val="en-US"/>
-        </w:rPr>
-        <w:t xml:space="preserve"> the assessment</w:t>
+        <w:t>Finishing the assessment</w:t>
       </w:r>
     </w:p>
     <w:p>
@@ -1418,7 +1349,6 @@
           <w:lang w:val="en-US"/>
         </w:rPr>
       </w:pPr>
-      <w:proofErr w:type="gramStart"/>
       <w:r>
         <w:rPr>
           <w:lang w:val="en-US"/>
@@ -1433,7 +1363,6 @@
         <w:t>CmdLet</w:t>
       </w:r>
       <w:proofErr w:type="spellEnd"/>
-      <w:proofErr w:type="gramEnd"/>
       <w:r>
         <w:rPr>
           <w:lang w:val="en-US"/>
@@ -1542,37 +1471,152 @@
           <w:rFonts w:ascii="Courier New" w:hAnsi="Courier New" w:cs="Courier New"/>
           <w:lang w:val="en-US"/>
         </w:rPr>
-        <w:t xml:space="preserve"> -OutputFileNa</w:t>
-      </w:r>
-      <w:proofErr w:type="spellStart"/>
-      <w:r>
-        <w:rPr>
-          <w:rFonts w:ascii="Courier New" w:hAnsi="Courier New" w:cs="Courier New"/>
-          <w:lang w:val="en-US"/>
-        </w:rPr>
-        <w:t>me</w:t>
-      </w:r>
-      <w:proofErr w:type="spellEnd"/>
-      <w:r>
-        <w:rPr>
-          <w:rFonts w:ascii="Courier New" w:hAnsi="Courier New" w:cs="Courier New"/>
-          <w:lang w:val="en-US"/>
-        </w:rPr>
-        <w:t xml:space="preserve"> C:\Temp\</w:t>
-      </w:r>
-      <w:r>
-        <w:rPr>
-          <w:rFonts w:ascii="Courier New" w:hAnsi="Courier New" w:cs="Courier New"/>
-          <w:lang w:val="en-US"/>
-        </w:rPr>
-        <w:t>PAYGO</w:t>
-      </w:r>
-      <w:r>
-        <w:rPr>
-          <w:rFonts w:ascii="Courier New" w:hAnsi="Courier New" w:cs="Courier New"/>
-          <w:lang w:val="en-US"/>
-        </w:rPr>
-        <w:t>.csv</w:t>
+        <w:t xml:space="preserve"> -</w:t>
+      </w:r>
+      <w:proofErr w:type="spellStart"/>
+      <w:r>
+        <w:rPr>
+          <w:rFonts w:ascii="Courier New" w:hAnsi="Courier New" w:cs="Courier New"/>
+          <w:lang w:val="en-US"/>
+        </w:rPr>
+        <w:t>OutputFileName</w:t>
+      </w:r>
+      <w:proofErr w:type="spellEnd"/>
+      <w:r>
+        <w:rPr>
+          <w:rFonts w:ascii="Courier New" w:hAnsi="Courier New" w:cs="Courier New"/>
+          <w:lang w:val="en-US"/>
+        </w:rPr>
+        <w:t xml:space="preserve"> C:\Temp\PAYGO.csv</w:t>
+      </w:r>
+    </w:p>
+    <w:p>
+      <w:r>
+        <w:t>When using</w:t>
+      </w:r>
+      <w:r>
+        <w:t xml:space="preserve"> a server list text file</w:t>
+      </w:r>
+      <w:r>
+        <w:t>,</w:t>
+      </w:r>
+      <w:r>
+        <w:t xml:space="preserve"> the c</w:t>
+      </w:r>
+      <w:r>
+        <w:t xml:space="preserve">ommand </w:t>
+      </w:r>
+      <w:r>
+        <w:t>is</w:t>
+      </w:r>
+      <w:r>
+        <w:t>:</w:t>
+      </w:r>
+    </w:p>
+    <w:p>
+      <w:pPr>
+        <w:rPr>
+          <w:rFonts w:ascii="Courier New" w:hAnsi="Courier New" w:cs="Courier New"/>
+          <w:lang w:val="en-DE"/>
+        </w:rPr>
+      </w:pPr>
+      <w:r>
+        <w:rPr>
+          <w:rFonts w:ascii="Courier New" w:hAnsi="Courier New" w:cs="Courier New"/>
+          <w:lang w:val="en-US"/>
+        </w:rPr>
+        <w:lastRenderedPageBreak/>
+        <w:t>C</w:t>
+      </w:r>
+      <w:r>
+        <w:rPr>
+          <w:rFonts w:ascii="Courier New" w:hAnsi="Courier New" w:cs="Courier New"/>
+          <w:lang w:val="en-US"/>
+        </w:rPr>
+        <w:t>ollect</w:t>
+      </w:r>
+      <w:r>
+        <w:rPr>
+          <w:rFonts w:ascii="Courier New" w:hAnsi="Courier New" w:cs="Courier New"/>
+          <w:lang w:val="en-US"/>
+        </w:rPr>
+        <w:t xml:space="preserve">-PAYGO-Assessment </w:t>
+      </w:r>
+      <w:r>
+        <w:rPr>
+          <w:rFonts w:ascii="Courier New" w:hAnsi="Courier New" w:cs="Courier New"/>
+          <w:lang w:val="en-US"/>
+        </w:rPr>
+        <w:t>–</w:t>
+      </w:r>
+      <w:proofErr w:type="spellStart"/>
+      <w:r>
+        <w:rPr>
+          <w:rFonts w:ascii="Courier New" w:hAnsi="Courier New" w:cs="Courier New"/>
+          <w:lang w:val="en-DE"/>
+        </w:rPr>
+        <w:t>ServerListFile</w:t>
+      </w:r>
+      <w:proofErr w:type="spellEnd"/>
+      <w:r>
+        <w:rPr>
+          <w:rFonts w:ascii="Courier New" w:hAnsi="Courier New" w:cs="Courier New"/>
+          <w:lang w:val="en-DE"/>
+        </w:rPr>
+        <w:t xml:space="preserve"> </w:t>
+      </w:r>
+      <w:r>
+        <w:rPr>
+          <w:rFonts w:ascii="Courier New" w:hAnsi="Courier New" w:cs="Courier New"/>
+          <w:lang w:val="en-US"/>
+        </w:rPr>
+        <w:t>"&lt;</w:t>
+      </w:r>
+      <w:proofErr w:type="spellStart"/>
+      <w:r>
+        <w:rPr>
+          <w:rFonts w:ascii="Courier New" w:hAnsi="Courier New" w:cs="Courier New"/>
+          <w:lang w:val="en-US"/>
+        </w:rPr>
+        <w:t>path_to_txt_file</w:t>
+      </w:r>
+      <w:proofErr w:type="spellEnd"/>
+      <w:r>
+        <w:rPr>
+          <w:rFonts w:ascii="Courier New" w:hAnsi="Courier New" w:cs="Courier New"/>
+          <w:lang w:val="en-US"/>
+        </w:rPr>
+        <w:t>&gt;"</w:t>
+      </w:r>
+      <w:r>
+        <w:rPr>
+          <w:rFonts w:ascii="Courier New" w:hAnsi="Courier New" w:cs="Courier New"/>
+          <w:lang w:val="en-US"/>
+        </w:rPr>
+        <w:t xml:space="preserve"> </w:t>
+      </w:r>
+      <w:r>
+        <w:rPr>
+          <w:rFonts w:ascii="Courier New" w:hAnsi="Courier New" w:cs="Courier New"/>
+          <w:lang w:val="en-US"/>
+        </w:rPr>
+        <w:t>-</w:t>
+      </w:r>
+      <w:proofErr w:type="spellStart"/>
+      <w:r>
+        <w:rPr>
+          <w:rFonts w:ascii="Courier New" w:hAnsi="Courier New" w:cs="Courier New"/>
+          <w:lang w:val="en-US"/>
+        </w:rPr>
+        <w:t>OutputFileName</w:t>
+      </w:r>
+      <w:proofErr w:type="spellEnd"/>
+      <w:r>
+        <w:rPr>
+          <w:rFonts w:ascii="Courier New" w:hAnsi="Courier New" w:cs="Courier New"/>
+          <w:lang w:val="en-US"/>
+        </w:rPr>
+        <w:t xml:space="preserve"> C:\Temp\PAYGO.csv</w:t>
       </w:r>
     </w:p>
     <w:p>
@@ -1593,7 +1637,6 @@
         <w:rPr>
           <w:lang w:val="en-US"/>
         </w:rPr>
-        <w:lastRenderedPageBreak/>
         <w:t>Cleanup the customer environment</w:t>
       </w:r>
     </w:p>
@@ -1691,6 +1734,100 @@
         </w:rPr>
         <w:t>”</w:t>
       </w:r>
+    </w:p>
+    <w:p>
+      <w:pPr>
+        <w:rPr>
+          <w:lang w:val="en-US"/>
+        </w:rPr>
+      </w:pPr>
+      <w:r>
+        <w:rPr>
+          <w:lang w:val="en-US"/>
+        </w:rPr>
+        <w:t xml:space="preserve">When using </w:t>
+      </w:r>
+      <w:r>
+        <w:rPr>
+          <w:lang w:val="en-US"/>
+        </w:rPr>
+        <w:t>a server list from a text file, the command looks like this:</w:t>
+      </w:r>
+    </w:p>
+    <w:p>
+      <w:pPr>
+        <w:rPr>
+          <w:rFonts w:ascii="Courier New" w:hAnsi="Courier New" w:cs="Courier New"/>
+          <w:lang w:val="en-DE"/>
+        </w:rPr>
+      </w:pPr>
+      <w:r>
+        <w:rPr>
+          <w:rFonts w:ascii="Courier New" w:hAnsi="Courier New" w:cs="Courier New"/>
+          <w:lang w:val="en-US"/>
+        </w:rPr>
+        <w:t>Cleanup</w:t>
+      </w:r>
+      <w:r>
+        <w:rPr>
+          <w:rFonts w:ascii="Courier New" w:hAnsi="Courier New" w:cs="Courier New"/>
+          <w:lang w:val="en-US"/>
+        </w:rPr>
+        <w:t xml:space="preserve">-PAYGO-Assessment </w:t>
+      </w:r>
+      <w:r>
+        <w:rPr>
+          <w:rFonts w:ascii="Courier New" w:hAnsi="Courier New" w:cs="Courier New"/>
+          <w:lang w:val="en-US"/>
+        </w:rPr>
+        <w:t>–</w:t>
+      </w:r>
+      <w:proofErr w:type="spellStart"/>
+      <w:r>
+        <w:rPr>
+          <w:rFonts w:ascii="Courier New" w:hAnsi="Courier New" w:cs="Courier New"/>
+          <w:lang w:val="en-DE"/>
+        </w:rPr>
+        <w:t>ServerListFile</w:t>
+      </w:r>
+      <w:proofErr w:type="spellEnd"/>
+      <w:r>
+        <w:rPr>
+          <w:rFonts w:ascii="Courier New" w:hAnsi="Courier New" w:cs="Courier New"/>
+          <w:lang w:val="en-DE"/>
+        </w:rPr>
+        <w:t xml:space="preserve"> </w:t>
+      </w:r>
+      <w:r>
+        <w:rPr>
+          <w:rFonts w:ascii="Courier New" w:hAnsi="Courier New" w:cs="Courier New"/>
+          <w:lang w:val="en-US"/>
+        </w:rPr>
+        <w:t>"&lt;</w:t>
+      </w:r>
+      <w:proofErr w:type="spellStart"/>
+      <w:r>
+        <w:rPr>
+          <w:rFonts w:ascii="Courier New" w:hAnsi="Courier New" w:cs="Courier New"/>
+          <w:lang w:val="en-US"/>
+        </w:rPr>
+        <w:t>path_to_txt_file</w:t>
+      </w:r>
+      <w:proofErr w:type="spellEnd"/>
+      <w:r>
+        <w:rPr>
+          <w:rFonts w:ascii="Courier New" w:hAnsi="Courier New" w:cs="Courier New"/>
+          <w:lang w:val="en-US"/>
+        </w:rPr>
+        <w:t>&gt;"</w:t>
+      </w:r>
+    </w:p>
+    <w:p>
+      <w:pPr>
+        <w:rPr>
+          <w:lang w:val="en-DE"/>
+        </w:rPr>
+      </w:pPr>
     </w:p>
     <w:p>
       <w:pPr>
@@ -1724,7 +1861,7 @@
 </file>
 
 <file path=word/numbering.xml><?xml version="1.0" encoding="utf-8"?>
-<w:numbering xmlns:wpc="http://schemas.microsoft.com/office/word/2010/wordprocessingCanvas" xmlns:cx="http://schemas.microsoft.com/office/drawing/2014/chartex" xmlns:cx1="http://schemas.microsoft.com/office/drawing/2015/9/8/chartex" xmlns:cx2="http://schemas.microsoft.com/office/drawing/2015/10/21/chartex" xmlns:cx3="http://schemas.microsoft.com/office/drawing/2016/5/9/chartex" xmlns:cx4="http://schemas.microsoft.com/office/drawing/2016/5/10/chartex" xmlns:cx5="http://schemas.microsoft.com/office/drawing/2016/5/11/chartex" xmlns:cx6="http://schemas.microsoft.com/office/drawing/2016/5/12/chartex" xmlns:cx7="http://schemas.microsoft.com/office/drawing/2016/5/13/chartex" xmlns:cx8="http://schemas.microsoft.com/office/drawing/2016/5/14/chartex" xmlns:mc="http://schemas.openxmlformats.org/markup-compatibility/2006" xmlns:aink="http://schemas.microsoft.com/office/drawing/2016/ink" xmlns:am3d="http://schemas.microsoft.com/office/drawing/2017/model3d" xmlns:o="urn:schemas-microsoft-com:office:office" xmlns:oel="http://schemas.microsoft.com/office/2019/extlst" xmlns:r="http://schemas.openxmlformats.org/officeDocument/2006/relationships" xmlns:m="http://schemas.openxmlformats.org/officeDocument/2006/math" xmlns:v="urn:schemas-microsoft-com:vml" xmlns:wp14="http://schemas.microsoft.com/office/word/2010/wordprocessingDrawing" xmlns:wp="http://schemas.openxmlformats.org/drawingml/2006/wordprocessingDrawing" xmlns:w10="urn:schemas-microsoft-com:office:word" xmlns:w="http://schemas.openxmlformats.org/wordprocessingml/2006/main" xmlns:w14="http://schemas.microsoft.com/office/word/2010/wordml" xmlns:w15="http://schemas.microsoft.com/office/word/2012/wordml" xmlns:w16cex="http://schemas.microsoft.com/office/word/2018/wordml/cex" xmlns:w16cid="http://schemas.microsoft.com/office/word/2016/wordml/cid" xmlns:w16="http://schemas.microsoft.com/office/word/2018/wordml" xmlns:w16du="http://schemas.microsoft.com/office/word/2023/wordml/word16du" xmlns:w16sdtdh="http://schemas.microsoft.com/office/word/2020/wordml/sdtdatahash" xmlns:w16se="http://schemas.microsoft.com/office/word/2015/wordml/symex" xmlns:wpg="http://schemas.microsoft.com/office/word/2010/wordprocessingGroup" xmlns:wpi="http://schemas.microsoft.com/office/word/2010/wordprocessingInk" xmlns:wne="http://schemas.microsoft.com/office/word/2006/wordml" xmlns:wps="http://schemas.microsoft.com/office/word/2010/wordprocessingShape" mc:Ignorable="w14 w15 w16se w16cid w16 w16cex w16sdtdh w16du wp14">
+<w:numbering xmlns:wpc="http://schemas.microsoft.com/office/word/2010/wordprocessingCanvas" xmlns:cx="http://schemas.microsoft.com/office/drawing/2014/chartex" xmlns:cx1="http://schemas.microsoft.com/office/drawing/2015/9/8/chartex" xmlns:cx2="http://schemas.microsoft.com/office/drawing/2015/10/21/chartex" xmlns:cx3="http://schemas.microsoft.com/office/drawing/2016/5/9/chartex" xmlns:cx4="http://schemas.microsoft.com/office/drawing/2016/5/10/chartex" xmlns:cx5="http://schemas.microsoft.com/office/drawing/2016/5/11/chartex" xmlns:cx6="http://schemas.microsoft.com/office/drawing/2016/5/12/chartex" xmlns:cx7="http://schemas.microsoft.com/office/drawing/2016/5/13/chartex" xmlns:cx8="http://schemas.microsoft.com/office/drawing/2016/5/14/chartex" xmlns:mc="http://schemas.openxmlformats.org/markup-compatibility/2006" xmlns:aink="http://schemas.microsoft.com/office/drawing/2016/ink" xmlns:am3d="http://schemas.microsoft.com/office/drawing/2017/model3d" xmlns:o="urn:schemas-microsoft-com:office:office" xmlns:oel="http://schemas.microsoft.com/office/2019/extlst" xmlns:r="http://schemas.openxmlformats.org/officeDocument/2006/relationships" xmlns:m="http://schemas.openxmlformats.org/officeDocument/2006/math" xmlns:v="urn:schemas-microsoft-com:vml" xmlns:wp14="http://schemas.microsoft.com/office/word/2010/wordprocessingDrawing" xmlns:wp="http://schemas.openxmlformats.org/drawingml/2006/wordprocessingDrawing" xmlns:w10="urn:schemas-microsoft-com:office:word" xmlns:w="http://schemas.openxmlformats.org/wordprocessingml/2006/main" xmlns:w14="http://schemas.microsoft.com/office/word/2010/wordml" xmlns:w15="http://schemas.microsoft.com/office/word/2012/wordml" xmlns:w16cex="http://schemas.microsoft.com/office/word/2018/wordml/cex" xmlns:w16cid="http://schemas.microsoft.com/office/word/2016/wordml/cid" xmlns:w16="http://schemas.microsoft.com/office/word/2018/wordml" xmlns:w16du="http://schemas.microsoft.com/office/word/2023/wordml/word16du" xmlns:w16sdtdh="http://schemas.microsoft.com/office/word/2020/wordml/sdtdatahash" xmlns:w16sdtfl="http://schemas.microsoft.com/office/word/2024/wordml/sdtformatlock" xmlns:w16se="http://schemas.microsoft.com/office/word/2015/wordml/symex" xmlns:wpg="http://schemas.microsoft.com/office/word/2010/wordprocessingGroup" xmlns:wpi="http://schemas.microsoft.com/office/word/2010/wordprocessingInk" xmlns:wne="http://schemas.microsoft.com/office/word/2006/wordml" xmlns:wps="http://schemas.microsoft.com/office/word/2010/wordprocessingShape" mc:Ignorable="w14 w15 w16se w16cid w16 w16cex w16sdtdh w16sdtfl w16du wp14">
   <w:abstractNum w:abstractNumId="0" w15:restartNumberingAfterBreak="0">
     <w:nsid w:val="4C797E61"/>
     <w:multiLevelType w:val="hybridMultilevel"/>
@@ -1844,7 +1981,7 @@
 </file>
 
 <file path=word/styles.xml><?xml version="1.0" encoding="utf-8"?>
-<w:styles xmlns:mc="http://schemas.openxmlformats.org/markup-compatibility/2006" xmlns:r="http://schemas.openxmlformats.org/officeDocument/2006/relationships" xmlns:w="http://schemas.openxmlformats.org/wordprocessingml/2006/main" xmlns:w14="http://schemas.microsoft.com/office/word/2010/wordml" xmlns:w15="http://schemas.microsoft.com/office/word/2012/wordml" xmlns:w16cex="http://schemas.microsoft.com/office/word/2018/wordml/cex" xmlns:w16cid="http://schemas.microsoft.com/office/word/2016/wordml/cid" xmlns:w16="http://schemas.microsoft.com/office/word/2018/wordml" xmlns:w16du="http://schemas.microsoft.com/office/word/2023/wordml/word16du" xmlns:w16sdtdh="http://schemas.microsoft.com/office/word/2020/wordml/sdtdatahash" xmlns:w16se="http://schemas.microsoft.com/office/word/2015/wordml/symex" mc:Ignorable="w14 w15 w16se w16cid w16 w16cex w16sdtdh w16du">
+<w:styles xmlns:mc="http://schemas.openxmlformats.org/markup-compatibility/2006" xmlns:r="http://schemas.openxmlformats.org/officeDocument/2006/relationships" xmlns:w="http://schemas.openxmlformats.org/wordprocessingml/2006/main" xmlns:w14="http://schemas.microsoft.com/office/word/2010/wordml" xmlns:w15="http://schemas.microsoft.com/office/word/2012/wordml" xmlns:w16cex="http://schemas.microsoft.com/office/word/2018/wordml/cex" xmlns:w16cid="http://schemas.microsoft.com/office/word/2016/wordml/cid" xmlns:w16="http://schemas.microsoft.com/office/word/2018/wordml" xmlns:w16du="http://schemas.microsoft.com/office/word/2023/wordml/word16du" xmlns:w16sdtdh="http://schemas.microsoft.com/office/word/2020/wordml/sdtdatahash" xmlns:w16sdtfl="http://schemas.microsoft.com/office/word/2024/wordml/sdtformatlock" xmlns:w16se="http://schemas.microsoft.com/office/word/2015/wordml/symex" mc:Ignorable="w14 w15 w16se w16cid w16 w16cex w16sdtdh w16sdtfl w16du">
   <w:docDefaults>
     <w:rPrDefault>
       <w:rPr>
@@ -2243,6 +2380,7 @@
   <w:style w:type="paragraph" w:default="1" w:styleId="Normal">
     <w:name w:val="Normal"/>
     <w:qFormat/>
+    <w:rsid w:val="000049D6"/>
   </w:style>
   <w:style w:type="paragraph" w:styleId="Heading1">
     <w:name w:val="heading 1"/>
@@ -2445,7 +2583,6 @@
   <w:style w:type="character" w:default="1" w:styleId="DefaultParagraphFont">
     <w:name w:val="Default Paragraph Font"/>
     <w:uiPriority w:val="1"/>
-    <w:semiHidden/>
     <w:unhideWhenUsed/>
   </w:style>
   <w:style w:type="table" w:default="1" w:styleId="TableNormal">
@@ -2756,6 +2893,112 @@
       <w:smallCaps/>
       <w:color w:val="0F4761" w:themeColor="accent1" w:themeShade="BF"/>
       <w:spacing w:val="5"/>
+    </w:rPr>
+  </w:style>
+  <w:style w:type="character" w:styleId="BookTitle">
+    <w:name w:val="Book Title"/>
+    <w:basedOn w:val="DefaultParagraphFont"/>
+    <w:uiPriority w:val="33"/>
+    <w:qFormat/>
+    <w:rsid w:val="00D00C41"/>
+    <w:rPr>
+      <w:b/>
+      <w:bCs/>
+      <w:i/>
+      <w:iCs/>
+      <w:spacing w:val="5"/>
+    </w:rPr>
+  </w:style>
+  <w:style w:type="paragraph" w:styleId="Caption">
+    <w:name w:val="caption"/>
+    <w:basedOn w:val="Normal"/>
+    <w:next w:val="Normal"/>
+    <w:uiPriority w:val="35"/>
+    <w:semiHidden/>
+    <w:unhideWhenUsed/>
+    <w:qFormat/>
+    <w:rsid w:val="00D00C41"/>
+    <w:pPr>
+      <w:spacing w:after="200" w:line="240" w:lineRule="auto"/>
+    </w:pPr>
+    <w:rPr>
+      <w:i/>
+      <w:iCs/>
+      <w:color w:val="0E2841" w:themeColor="text2"/>
+      <w:sz w:val="18"/>
+      <w:szCs w:val="18"/>
+    </w:rPr>
+  </w:style>
+  <w:style w:type="character" w:styleId="Emphasis">
+    <w:name w:val="Emphasis"/>
+    <w:basedOn w:val="DefaultParagraphFont"/>
+    <w:uiPriority w:val="20"/>
+    <w:qFormat/>
+    <w:rsid w:val="00D00C41"/>
+    <w:rPr>
+      <w:i/>
+      <w:iCs/>
+    </w:rPr>
+  </w:style>
+  <w:style w:type="paragraph" w:styleId="NoSpacing">
+    <w:name w:val="No Spacing"/>
+    <w:uiPriority w:val="1"/>
+    <w:qFormat/>
+    <w:rsid w:val="00D00C41"/>
+    <w:pPr>
+      <w:spacing w:after="0" w:line="240" w:lineRule="auto"/>
+    </w:pPr>
+  </w:style>
+  <w:style w:type="character" w:styleId="Strong">
+    <w:name w:val="Strong"/>
+    <w:basedOn w:val="DefaultParagraphFont"/>
+    <w:uiPriority w:val="22"/>
+    <w:qFormat/>
+    <w:rsid w:val="00D00C41"/>
+    <w:rPr>
+      <w:b/>
+      <w:bCs/>
+    </w:rPr>
+  </w:style>
+  <w:style w:type="character" w:styleId="SubtleEmphasis">
+    <w:name w:val="Subtle Emphasis"/>
+    <w:basedOn w:val="DefaultParagraphFont"/>
+    <w:uiPriority w:val="19"/>
+    <w:qFormat/>
+    <w:rsid w:val="00D00C41"/>
+    <w:rPr>
+      <w:i/>
+      <w:iCs/>
+      <w:color w:val="404040" w:themeColor="text1" w:themeTint="BF"/>
+    </w:rPr>
+  </w:style>
+  <w:style w:type="character" w:styleId="SubtleReference">
+    <w:name w:val="Subtle Reference"/>
+    <w:basedOn w:val="DefaultParagraphFont"/>
+    <w:uiPriority w:val="31"/>
+    <w:qFormat/>
+    <w:rsid w:val="00D00C41"/>
+    <w:rPr>
+      <w:smallCaps/>
+      <w:color w:val="5A5A5A" w:themeColor="text1" w:themeTint="A5"/>
+    </w:rPr>
+  </w:style>
+  <w:style w:type="paragraph" w:styleId="TOCHeading">
+    <w:name w:val="TOC Heading"/>
+    <w:basedOn w:val="Heading1"/>
+    <w:next w:val="Normal"/>
+    <w:uiPriority w:val="39"/>
+    <w:semiHidden/>
+    <w:unhideWhenUsed/>
+    <w:qFormat/>
+    <w:rsid w:val="00D00C41"/>
+    <w:pPr>
+      <w:spacing w:before="240" w:after="0"/>
+      <w:outlineLvl w:val="9"/>
+    </w:pPr>
+    <w:rPr>
+      <w:sz w:val="32"/>
+      <w:szCs w:val="32"/>
     </w:rPr>
   </w:style>
 </w:styles>

</xml_diff>